<commit_message>
Add GitHub Actions screenshots, repo link and CI badge to report
</commit_message>
<xml_diff>
--- a/reports/MLOps_Assignment1_Report.docx
+++ b/reports/MLOps_Assignment1_Report.docx
@@ -125,10 +125,13 @@
     <w:tbl>
       <w:tblPr>
         <w:tblStyle w:val="Table"/>
-        <w:tblW w:type="pct" w:w="0.0"/>
+        <w:tblW w:type="pct" w:w="5000.0"/>
         <w:tblLook w:firstRow="0" w:lastRow="0" w:firstColumn="0" w:lastColumn="0" w:noHBand="0" w:noVBand="0" w:val="0000"/>
       </w:tblPr>
-      <w:tblGrid/>
+      <w:tblGrid>
+        <w:gridCol w:w="3960"/>
+        <w:gridCol w:w="3960"/>
+      </w:tblGrid>
       <w:tr>
         <w:tc>
           <w:p>
@@ -201,6 +204,9 @@
               <w:pStyle w:val="Compact"/>
               <w:jc w:val="left"/>
             </w:pPr>
+            <w:r>
+              <w:t xml:space="preserve">https://github.com/Tirumala-devi-damarla/heart-disease-mlops</w:t>
+            </w:r>
           </w:p>
         </w:tc>
       </w:tr>
@@ -404,31 +410,7 @@
         <w:rPr>
           <w:rStyle w:val="NormalTok"/>
         </w:rPr>
-        <w:t xml:space="preserve"> clone </w:t>
-      </w:r>
-      <w:r>
-        <w:rPr>
-          <w:rStyle w:val="OperatorTok"/>
-        </w:rPr>
-        <w:t xml:space="preserve">&lt;</w:t>
-      </w:r>
-      <w:r>
-        <w:rPr>
-          <w:rStyle w:val="NormalTok"/>
-        </w:rPr>
-        <w:t xml:space="preserve">repository-url</w:t>
-      </w:r>
-      <w:r>
-        <w:rPr>
-          <w:rStyle w:val="OperatorTok"/>
-        </w:rPr>
-        <w:t xml:space="preserve">&gt;</w:t>
-      </w:r>
-      <w:r>
-        <w:rPr>
-          <w:rStyle w:val="NormalTok"/>
-        </w:rPr>
-        <w:t xml:space="preserve"> </w:t>
+        <w:t xml:space="preserve"> clone https://github.com/Tirumala-devi-damarla/heart-disease-mlops.git </w:t>
       </w:r>
       <w:r>
         <w:rPr>
@@ -3810,7 +3792,7 @@
       </w:r>
     </w:p>
     <w:bookmarkEnd w:id="42"/>
-    <w:bookmarkStart w:id="46" w:name="cicd-pipeline-and-automated-testing"/>
+    <w:bookmarkStart w:id="49" w:name="cicd-pipeline-and-automated-testing"/>
     <w:p>
       <w:pPr>
         <w:pStyle w:val="Heading1"/>
@@ -4173,7 +4155,7 @@
       </w:r>
     </w:p>
     <w:bookmarkEnd w:id="44"/>
-    <w:bookmarkStart w:id="45" w:name="github-actions-workflow"/>
+    <w:bookmarkStart w:id="48" w:name="github-actions-workflow"/>
     <w:p>
       <w:pPr>
         <w:pStyle w:val="Heading2"/>
@@ -4484,72 +4466,189 @@
         <w:pStyle w:val="BodyText"/>
       </w:pPr>
       <w:r>
-        <w:rPr>
-          <w:iCs/>
-          <w:i/>
-        </w:rPr>
-        <w:t xml:space="preserve">&lt;Insert screenshot: GitHub Actions run with all four jobs green -</w:t>
-      </w:r>
-      <w:r>
-        <w:rPr>
-          <w:iCs/>
-          <w:i/>
-        </w:rPr>
-        <w:t xml:space="preserve"> </w:t>
-      </w:r>
-      <w:r>
-        <w:rPr>
-          <w:rStyle w:val="VerbatimChar"/>
-          <w:iCs/>
-          <w:i/>
-        </w:rPr>
-        <w:t xml:space="preserve">screenshots/02_github_actions_run.png</w:t>
-      </w:r>
-      <w:r>
-        <w:rPr>
-          <w:iCs/>
-          <w:i/>
-        </w:rPr>
-        <w:t xml:space="preserve">&gt;</w:t>
-      </w:r>
-    </w:p>
-    <w:p>
-      <w:pPr>
-        <w:pStyle w:val="BodyText"/>
-      </w:pPr>
-      <w:r>
-        <w:rPr>
-          <w:iCs/>
-          <w:i/>
-        </w:rPr>
-        <w:t xml:space="preserve">&lt;Insert screenshot: artifacts of the run -</w:t>
-      </w:r>
-      <w:r>
-        <w:rPr>
-          <w:iCs/>
-          <w:i/>
-        </w:rPr>
-        <w:t xml:space="preserve"> </w:t>
-      </w:r>
-      <w:r>
-        <w:rPr>
-          <w:rStyle w:val="VerbatimChar"/>
-          <w:iCs/>
-          <w:i/>
-        </w:rPr>
-        <w:t xml:space="preserve">screenshots/03_github_actions_artifacts.png</w:t>
-      </w:r>
-      <w:r>
-        <w:rPr>
-          <w:iCs/>
-          <w:i/>
-        </w:rPr>
-        <w:t xml:space="preserve">&gt;</w:t>
-      </w:r>
-    </w:p>
-    <w:bookmarkEnd w:id="45"/>
-    <w:bookmarkEnd w:id="46"/>
-    <w:bookmarkStart w:id="55" w:name="containerisation-and-deployment"/>
+        <w:t xml:space="preserve">The first run on GitHub (run #1, triggered by the initial push) passed all four jobs in about</w:t>
+      </w:r>
+      <w:r>
+        <w:t xml:space="preserve"> </w:t>
+      </w:r>
+      <w:r>
+        <w:t xml:space="preserve">3 minutes and produced 5 artifacts. On the fresh Ubuntu runner the selected model reached exactly</w:t>
+      </w:r>
+      <w:r>
+        <w:t xml:space="preserve"> </w:t>
+      </w:r>
+      <w:r>
+        <w:t xml:space="preserve">the same CV ROC-AUC (0.9075) as locally, which is another check that the pipeline is reproducible.</w:t>
+      </w:r>
+    </w:p>
+    <w:p>
+      <w:pPr>
+        <w:pStyle w:val="CaptionedFigure"/>
+      </w:pPr>
+      <w:r>
+        <w:drawing>
+          <wp:inline>
+            <wp:extent cx="5334000" cy="5556250"/>
+            <wp:effectExtent b="0" l="0" r="0" t="0"/>
+            <wp:docPr descr="GitHub Actions run #1 - all four jobs passed" title="" id="1" name="Picture"/>
+            <a:graphic>
+              <a:graphicData uri="http://schemas.openxmlformats.org/drawingml/2006/picture">
+                <pic:pic>
+                  <pic:nvPicPr>
+                    <pic:cNvPr descr="../screenshots/02_github_actions_run.png" id="0" name="Picture"/>
+                    <pic:cNvPicPr>
+                      <a:picLocks noChangeArrowheads="1" noChangeAspect="1"/>
+                    </pic:cNvPicPr>
+                  </pic:nvPicPr>
+                  <pic:blipFill>
+                    <a:blip r:embed="rId45"/>
+                    <a:stretch>
+                      <a:fillRect/>
+                    </a:stretch>
+                  </pic:blipFill>
+                  <pic:spPr bwMode="auto">
+                    <a:xfrm>
+                      <a:off x="0" y="0"/>
+                      <a:ext cx="5334000" cy="5556250"/>
+                    </a:xfrm>
+                    <a:prstGeom prst="rect">
+                      <a:avLst/>
+                    </a:prstGeom>
+                    <a:noFill/>
+                    <a:ln w="9525">
+                      <a:noFill/>
+                      <a:headEnd/>
+                      <a:tailEnd/>
+                    </a:ln>
+                  </pic:spPr>
+                </pic:pic>
+              </a:graphicData>
+            </a:graphic>
+          </wp:inline>
+        </w:drawing>
+      </w:r>
+    </w:p>
+    <w:p>
+      <w:pPr>
+        <w:pStyle w:val="ImageCaption"/>
+      </w:pPr>
+      <w:r>
+        <w:t xml:space="preserve">GitHub Actions run #1 - all four jobs passed</w:t>
+      </w:r>
+    </w:p>
+    <w:p>
+      <w:pPr>
+        <w:pStyle w:val="CaptionedFigure"/>
+      </w:pPr>
+      <w:r>
+        <w:drawing>
+          <wp:inline>
+            <wp:extent cx="5334000" cy="4074583"/>
+            <wp:effectExtent b="0" l="0" r="0" t="0"/>
+            <wp:docPr descr="Steps of the training job" title="" id="1" name="Picture"/>
+            <a:graphic>
+              <a:graphicData uri="http://schemas.openxmlformats.org/drawingml/2006/picture">
+                <pic:pic>
+                  <pic:nvPicPr>
+                    <pic:cNvPr descr="../screenshots/03_github_actions_training_job.png" id="0" name="Picture"/>
+                    <pic:cNvPicPr>
+                      <a:picLocks noChangeArrowheads="1" noChangeAspect="1"/>
+                    </pic:cNvPicPr>
+                  </pic:nvPicPr>
+                  <pic:blipFill>
+                    <a:blip r:embed="rId46"/>
+                    <a:stretch>
+                      <a:fillRect/>
+                    </a:stretch>
+                  </pic:blipFill>
+                  <pic:spPr bwMode="auto">
+                    <a:xfrm>
+                      <a:off x="0" y="0"/>
+                      <a:ext cx="5334000" cy="4074583"/>
+                    </a:xfrm>
+                    <a:prstGeom prst="rect">
+                      <a:avLst/>
+                    </a:prstGeom>
+                    <a:noFill/>
+                    <a:ln w="9525">
+                      <a:noFill/>
+                      <a:headEnd/>
+                      <a:tailEnd/>
+                    </a:ln>
+                  </pic:spPr>
+                </pic:pic>
+              </a:graphicData>
+            </a:graphic>
+          </wp:inline>
+        </w:drawing>
+      </w:r>
+    </w:p>
+    <w:p>
+      <w:pPr>
+        <w:pStyle w:val="ImageCaption"/>
+      </w:pPr>
+      <w:r>
+        <w:t xml:space="preserve">Steps of the training job</w:t>
+      </w:r>
+    </w:p>
+    <w:p>
+      <w:pPr>
+        <w:pStyle w:val="CaptionedFigure"/>
+      </w:pPr>
+      <w:r>
+        <w:drawing>
+          <wp:inline>
+            <wp:extent cx="5334000" cy="2269001"/>
+            <wp:effectExtent b="0" l="0" r="0" t="0"/>
+            <wp:docPr descr="CI logs (training, quality gate, Docker smoke test) and the uploaded artifacts" title="" id="1" name="Picture"/>
+            <a:graphic>
+              <a:graphicData uri="http://schemas.openxmlformats.org/drawingml/2006/picture">
+                <pic:pic>
+                  <pic:nvPicPr>
+                    <pic:cNvPr descr="../screenshots/04_github_actions_logs_artifacts.png" id="0" name="Picture"/>
+                    <pic:cNvPicPr>
+                      <a:picLocks noChangeArrowheads="1" noChangeAspect="1"/>
+                    </pic:cNvPicPr>
+                  </pic:nvPicPr>
+                  <pic:blipFill>
+                    <a:blip r:embed="rId47"/>
+                    <a:stretch>
+                      <a:fillRect/>
+                    </a:stretch>
+                  </pic:blipFill>
+                  <pic:spPr bwMode="auto">
+                    <a:xfrm>
+                      <a:off x="0" y="0"/>
+                      <a:ext cx="5334000" cy="2269001"/>
+                    </a:xfrm>
+                    <a:prstGeom prst="rect">
+                      <a:avLst/>
+                    </a:prstGeom>
+                    <a:noFill/>
+                    <a:ln w="9525">
+                      <a:noFill/>
+                      <a:headEnd/>
+                      <a:tailEnd/>
+                    </a:ln>
+                  </pic:spPr>
+                </pic:pic>
+              </a:graphicData>
+            </a:graphic>
+          </wp:inline>
+        </w:drawing>
+      </w:r>
+    </w:p>
+    <w:p>
+      <w:pPr>
+        <w:pStyle w:val="ImageCaption"/>
+      </w:pPr>
+      <w:r>
+        <w:t xml:space="preserve">CI logs (training, quality gate, Docker smoke test) and the uploaded artifacts</w:t>
+      </w:r>
+    </w:p>
+    <w:bookmarkEnd w:id="48"/>
+    <w:bookmarkEnd w:id="49"/>
+    <w:bookmarkStart w:id="58" w:name="containerisation-and-deployment"/>
     <w:p>
       <w:pPr>
         <w:pStyle w:val="Heading1"/>
@@ -4558,7 +4657,7 @@
         <w:t xml:space="preserve">9. Containerisation and deployment</w:t>
       </w:r>
     </w:p>
-    <w:bookmarkStart w:id="50" w:name="docker"/>
+    <w:bookmarkStart w:id="53" w:name="docker"/>
     <w:p>
       <w:pPr>
         <w:pStyle w:val="Heading2"/>
@@ -5052,7 +5151,7 @@
                     </pic:cNvPicPr>
                   </pic:nvPicPr>
                   <pic:blipFill>
-                    <a:blip r:embed="rId47"/>
+                    <a:blip r:embed="rId50"/>
                     <a:stretch>
                       <a:fillRect/>
                     </a:stretch>
@@ -5107,7 +5206,7 @@
                     </pic:cNvPicPr>
                   </pic:nvPicPr>
                   <pic:blipFill>
-                    <a:blip r:embed="rId48"/>
+                    <a:blip r:embed="rId51"/>
                     <a:stretch>
                       <a:fillRect/>
                     </a:stretch>
@@ -5162,7 +5261,7 @@
                     </pic:cNvPicPr>
                   </pic:nvPicPr>
                   <pic:blipFill>
-                    <a:blip r:embed="rId49"/>
+                    <a:blip r:embed="rId52"/>
                     <a:stretch>
                       <a:fillRect/>
                     </a:stretch>
@@ -5197,8 +5296,8 @@
         <w:t xml:space="preserve">Swagger UI of the API</w:t>
       </w:r>
     </w:p>
-    <w:bookmarkEnd w:id="50"/>
-    <w:bookmarkStart w:id="51" w:name="kubernetes-manifests-k8s"/>
+    <w:bookmarkEnd w:id="53"/>
+    <w:bookmarkStart w:id="54" w:name="kubernetes-manifests-k8s"/>
     <w:p>
       <w:pPr>
         <w:pStyle w:val="Heading2"/>
@@ -5479,8 +5578,8 @@
         </w:tc>
       </w:tr>
     </w:tbl>
-    <w:bookmarkEnd w:id="51"/>
-    <w:bookmarkStart w:id="54" w:name="deployment-on-minikube-and-verification"/>
+    <w:bookmarkEnd w:id="54"/>
+    <w:bookmarkStart w:id="57" w:name="deployment-on-minikube-and-verification"/>
     <w:p>
       <w:pPr>
         <w:pStyle w:val="Heading2"/>
@@ -5587,7 +5686,7 @@
                     </pic:cNvPicPr>
                   </pic:nvPicPr>
                   <pic:blipFill>
-                    <a:blip r:embed="rId52"/>
+                    <a:blip r:embed="rId55"/>
                     <a:stretch>
                       <a:fillRect/>
                     </a:stretch>
@@ -5642,7 +5741,7 @@
                     </pic:cNvPicPr>
                   </pic:nvPicPr>
                   <pic:blipFill>
-                    <a:blip r:embed="rId53"/>
+                    <a:blip r:embed="rId56"/>
                     <a:stretch>
                       <a:fillRect/>
                     </a:stretch>
@@ -5755,9 +5854,9 @@
         <w:t xml:space="preserve">.</w:t>
       </w:r>
     </w:p>
-    <w:bookmarkEnd w:id="54"/>
-    <w:bookmarkEnd w:id="55"/>
-    <w:bookmarkStart w:id="58" w:name="monitoring-and-logging"/>
+    <w:bookmarkEnd w:id="57"/>
+    <w:bookmarkEnd w:id="58"/>
+    <w:bookmarkStart w:id="61" w:name="monitoring-and-logging"/>
     <w:p>
       <w:pPr>
         <w:pStyle w:val="Heading1"/>
@@ -6087,7 +6186,7 @@
                     </pic:cNvPicPr>
                   </pic:nvPicPr>
                   <pic:blipFill>
-                    <a:blip r:embed="rId56"/>
+                    <a:blip r:embed="rId59"/>
                     <a:stretch>
                       <a:fillRect/>
                     </a:stretch>
@@ -6142,7 +6241,7 @@
                     </pic:cNvPicPr>
                   </pic:nvPicPr>
                   <pic:blipFill>
-                    <a:blip r:embed="rId57"/>
+                    <a:blip r:embed="rId60"/>
                     <a:stretch>
                       <a:fillRect/>
                     </a:stretch>
@@ -6177,8 +6276,8 @@
         <w:t xml:space="preserve">Grafana dashboard: totals, request rate, latency p50/p95, predictions by class, status codes and probability distribution</w:t>
       </w:r>
     </w:p>
-    <w:bookmarkEnd w:id="58"/>
-    <w:bookmarkStart w:id="60" w:name="architecture"/>
+    <w:bookmarkEnd w:id="61"/>
+    <w:bookmarkStart w:id="63" w:name="architecture"/>
     <w:p>
       <w:pPr>
         <w:pStyle w:val="Heading1"/>
@@ -6207,7 +6306,7 @@
                     </pic:cNvPicPr>
                   </pic:nvPicPr>
                   <pic:blipFill>
-                    <a:blip r:embed="rId59"/>
+                    <a:blip r:embed="rId62"/>
                     <a:stretch>
                       <a:fillRect/>
                     </a:stretch>
@@ -6268,8 +6367,8 @@
         <w:t xml:space="preserve">and visualised in Grafana.</w:t>
       </w:r>
     </w:p>
-    <w:bookmarkEnd w:id="60"/>
-    <w:bookmarkStart w:id="61" w:name="challenges-and-lessons-learned"/>
+    <w:bookmarkEnd w:id="63"/>
+    <w:bookmarkStart w:id="64" w:name="challenges-and-lessons-learned"/>
     <w:p>
       <w:pPr>
         <w:pStyle w:val="Heading1"/>
@@ -6574,8 +6673,8 @@
         <w:t xml:space="preserve">addon was enabled.</w:t>
       </w:r>
     </w:p>
-    <w:bookmarkEnd w:id="61"/>
-    <w:bookmarkStart w:id="62" w:name="conclusion-and-future-work"/>
+    <w:bookmarkEnd w:id="64"/>
+    <w:bookmarkStart w:id="65" w:name="conclusion-and-future-work"/>
     <w:p>
       <w:pPr>
         <w:pStyle w:val="Heading1"/>
@@ -6646,8 +6745,8 @@
         <w:t xml:space="preserve">generalisation.</w:t>
       </w:r>
     </w:p>
-    <w:bookmarkEnd w:id="62"/>
-    <w:bookmarkStart w:id="63" w:name="references"/>
+    <w:bookmarkEnd w:id="65"/>
+    <w:bookmarkStart w:id="66" w:name="references"/>
     <w:p>
       <w:pPr>
         <w:pStyle w:val="Heading1"/>
@@ -6750,7 +6849,7 @@
         <w:t xml:space="preserve">Prometheus and Grafana documentation - https://prometheus.io/docs, https://grafana.com/docs</w:t>
       </w:r>
     </w:p>
-    <w:bookmarkEnd w:id="63"/>
+    <w:bookmarkEnd w:id="66"/>
     <w:sectPr/>
   </w:body>
 </w:document>

</xml_diff>

<commit_message>
Update CI screenshots to run #3 and tidy MLflow screenshots
</commit_message>
<xml_diff>
--- a/reports/MLOps_Assignment1_Report.docx
+++ b/reports/MLOps_Assignment1_Report.docx
@@ -3422,7 +3422,7 @@
       <w:r>
         <w:drawing>
           <wp:inline>
-            <wp:extent cx="5334000" cy="4333875"/>
+            <wp:extent cx="5334000" cy="4203858"/>
             <wp:effectExtent b="0" l="0" r="0" t="0"/>
             <wp:docPr descr="Selected run: parameters, metrics and tags" title="" id="1" name="Picture"/>
             <a:graphic>
@@ -3443,7 +3443,7 @@
                   <pic:spPr bwMode="auto">
                     <a:xfrm>
                       <a:off x="0" y="0"/>
-                      <a:ext cx="5334000" cy="4333875"/>
+                      <a:ext cx="5334000" cy="4203858"/>
                     </a:xfrm>
                     <a:prstGeom prst="rect">
                       <a:avLst/>
@@ -4466,13 +4466,25 @@
         <w:pStyle w:val="BodyText"/>
       </w:pPr>
       <w:r>
-        <w:t xml:space="preserve">The first run on GitHub (run #1, triggered by the initial push) passed all four jobs in about</w:t>
-      </w:r>
-      <w:r>
-        <w:t xml:space="preserve"> </w:t>
-      </w:r>
-      <w:r>
-        <w:t xml:space="preserve">3 minutes and produced 5 artifacts. On the fresh Ubuntu runner the selected model reached exactly</w:t>
+        <w:t xml:space="preserve">The latest run on GitHub (run #3, triggered by a push to</w:t>
+      </w:r>
+      <w:r>
+        <w:t xml:space="preserve"> </w:t>
+      </w:r>
+      <w:r>
+        <w:rPr>
+          <w:rStyle w:val="VerbatimChar"/>
+        </w:rPr>
+        <w:t xml:space="preserve">main</w:t>
+      </w:r>
+      <w:r>
+        <w:t xml:space="preserve">) passed all four jobs in about</w:t>
+      </w:r>
+      <w:r>
+        <w:t xml:space="preserve"> </w:t>
+      </w:r>
+      <w:r>
+        <w:t xml:space="preserve">3.5 minutes and produced 5 artifacts. On the fresh Ubuntu runner the selected model reached exactly</w:t>
       </w:r>
       <w:r>
         <w:t xml:space="preserve"> </w:t>
@@ -4490,7 +4502,7 @@
           <wp:inline>
             <wp:extent cx="5334000" cy="5556250"/>
             <wp:effectExtent b="0" l="0" r="0" t="0"/>
-            <wp:docPr descr="GitHub Actions run #1 - all four jobs passed" title="" id="1" name="Picture"/>
+            <wp:docPr descr="GitHub Actions run #3 - all four jobs passed" title="" id="1" name="Picture"/>
             <a:graphic>
               <a:graphicData uri="http://schemas.openxmlformats.org/drawingml/2006/picture">
                 <pic:pic>
@@ -4533,7 +4545,7 @@
         <w:pStyle w:val="ImageCaption"/>
       </w:pPr>
       <w:r>
-        <w:t xml:space="preserve">GitHub Actions run #1 - all four jobs passed</w:t>
+        <w:t xml:space="preserve">GitHub Actions run #3 - all four jobs passed</w:t>
       </w:r>
     </w:p>
     <w:p>

</xml_diff>

<commit_message>
Update report with CI run screenshots
</commit_message>
<xml_diff>
--- a/reports/MLOps_Assignment1_Report.docx
+++ b/reports/MLOps_Assignment1_Report.docx
@@ -760,7 +760,7 @@
         <w:rPr>
           <w:rStyle w:val="VerbatimChar"/>
         </w:rPr>
-        <w:t xml:space="preserve">README.md</w:t>
+        <w:t xml:space="preserve">RUN_INSTRUCTIONS.md</w:t>
       </w:r>
       <w:r>
         <w:t xml:space="preserve">.</w:t>
@@ -4466,7 +4466,7 @@
         <w:pStyle w:val="BodyText"/>
       </w:pPr>
       <w:r>
-        <w:t xml:space="preserve">The latest run on GitHub (run #3, triggered by a push to</w:t>
+        <w:t xml:space="preserve">The run on GitHub (run #1, triggered by a push to</w:t>
       </w:r>
       <w:r>
         <w:t xml:space="preserve"> </w:t>
@@ -4478,13 +4478,13 @@
         <w:t xml:space="preserve">main</w:t>
       </w:r>
       <w:r>
-        <w:t xml:space="preserve">) passed all four jobs in about</w:t>
-      </w:r>
-      <w:r>
-        <w:t xml:space="preserve"> </w:t>
-      </w:r>
-      <w:r>
-        <w:t xml:space="preserve">3.5 minutes and produced 5 artifacts. On the fresh Ubuntu runner the selected model reached exactly</w:t>
+        <w:t xml:space="preserve">) passed all four jobs in under</w:t>
+      </w:r>
+      <w:r>
+        <w:t xml:space="preserve"> </w:t>
+      </w:r>
+      <w:r>
+        <w:t xml:space="preserve">4 minutes and produced 5 artifacts. On the fresh Ubuntu runner the selected model reached exactly</w:t>
       </w:r>
       <w:r>
         <w:t xml:space="preserve"> </w:t>
@@ -4502,7 +4502,7 @@
           <wp:inline>
             <wp:extent cx="5334000" cy="5556250"/>
             <wp:effectExtent b="0" l="0" r="0" t="0"/>
-            <wp:docPr descr="GitHub Actions run #3 - all four jobs passed" title="" id="1" name="Picture"/>
+            <wp:docPr descr="GitHub Actions run #1 - all four jobs passed" title="" id="1" name="Picture"/>
             <a:graphic>
               <a:graphicData uri="http://schemas.openxmlformats.org/drawingml/2006/picture">
                 <pic:pic>
@@ -4545,7 +4545,7 @@
         <w:pStyle w:val="ImageCaption"/>
       </w:pPr>
       <w:r>
-        <w:t xml:space="preserve">GitHub Actions run #3 - all four jobs passed</w:t>
+        <w:t xml:space="preserve">GitHub Actions run #1 - all four jobs passed</w:t>
       </w:r>
     </w:p>
     <w:p>

</xml_diff>